<commit_message>
Report: match reference cover spacing, sizes and border
Co-Authored-By: Claude Sonnet 5.5 <noreply@anthropic.com>
Claude-Session: https://claude.ai/code/session_01Rfq5Dt6BZhovMc3QG1hQug
</commit_message>
<xml_diff>
--- a/docs/report/AppPanrom_Project_Report.docx
+++ b/docs/report/AppPanrom_Project_Report.docx
@@ -4,8 +4,85 @@
   <w:body>
     <w:p>
       <w:pPr>
-        <w:spacing w:after="60" w:before="120"/>
+        <w:spacing w:after="410" w:before="0" w:line="240"/>
+        <w:ind w:left="-280" w:right="-280"/>
         <w:jc w:val="center"/>
+      </w:pPr>
+      <w:r>
+        <w:rPr>
+          <w:rFonts w:ascii="Times New Roman" w:cs="Times New Roman" w:eastAsia="Times New Roman" w:hAnsi="Times New Roman"/>
+          <w:b/>
+          <w:bCs/>
+          <w:i w:val="false"/>
+          <w:iCs w:val="false"/>
+          <w:sz w:val="36"/>
+          <w:szCs w:val="36"/>
+        </w:rPr>
+        <w:t xml:space="preserve">APPANROM: A TANGLISH PROGRAMMING LANGUAGE</w:t>
+      </w:r>
+    </w:p>
+    <w:p>
+      <w:pPr>
+        <w:spacing w:after="966" w:before="0" w:line="240"/>
+        <w:ind w:left="-280" w:right="-280"/>
+        <w:jc w:val="center"/>
+      </w:pPr>
+      <w:r>
+        <w:rPr>
+          <w:rFonts w:ascii="Times New Roman" w:cs="Times New Roman" w:eastAsia="Times New Roman" w:hAnsi="Times New Roman"/>
+          <w:b/>
+          <w:bCs/>
+          <w:i w:val="false"/>
+          <w:iCs w:val="false"/>
+          <w:sz w:val="36"/>
+          <w:szCs w:val="36"/>
+        </w:rPr>
+        <w:t xml:space="preserve">AND ANDROID APP DEVELOPMENT STUDIO</w:t>
+      </w:r>
+    </w:p>
+    <w:p>
+      <w:pPr>
+        <w:spacing w:after="492" w:before="0" w:line="240"/>
+        <w:jc w:val="center"/>
+      </w:pPr>
+      <w:r>
+        <w:rPr>
+          <w:rFonts w:ascii="Times New Roman" w:cs="Times New Roman" w:eastAsia="Times New Roman" w:hAnsi="Times New Roman"/>
+          <w:b/>
+          <w:bCs/>
+          <w:i w:val="false"/>
+          <w:iCs w:val="false"/>
+          <w:sz w:val="32"/>
+          <w:szCs w:val="32"/>
+        </w:rPr>
+        <w:t xml:space="preserve">A PROJECT REPORT</w:t>
+      </w:r>
+    </w:p>
+    <w:p>
+      <w:pPr>
+        <w:spacing w:after="870" w:before="0" w:line="240"/>
+        <w:jc w:val="center"/>
+      </w:pPr>
+      <w:r>
+        <w:rPr>
+          <w:rFonts w:ascii="Times New Roman" w:cs="Times New Roman" w:eastAsia="Times New Roman" w:hAnsi="Times New Roman"/>
+          <w:b/>
+          <w:bCs/>
+          <w:i/>
+          <w:iCs/>
+          <w:sz w:val="32"/>
+          <w:szCs w:val="32"/>
+        </w:rPr>
+        <w:t xml:space="preserve">Submitted By</w:t>
+      </w:r>
+    </w:p>
+    <w:p>
+      <w:pPr>
+        <w:tabs>
+          <w:tab w:val="left" w:pos="6010"/>
+        </w:tabs>
+        <w:spacing w:after="310" w:before="0" w:line="240"/>
+        <w:ind w:left="1370"/>
       </w:pPr>
       <w:r>
         <w:rPr>
@@ -15,14 +92,8 @@
           <w:sz w:val="32"/>
           <w:szCs w:val="32"/>
         </w:rPr>
-        <w:t xml:space="preserve">APPANROM: A TANGLISH PROGRAMMING LANGUAGE</w:t>
-      </w:r>
-    </w:p>
-    <w:p>
-      <w:pPr>
-        <w:spacing w:after="420" w:before="0"/>
-        <w:jc w:val="center"/>
-      </w:pPr>
+        <w:t xml:space="preserve">P. SANTHOSH</w:t>
+      </w:r>
       <w:r>
         <w:rPr>
           <w:rFonts w:ascii="Times New Roman" w:cs="Times New Roman" w:eastAsia="Times New Roman" w:hAnsi="Times New Roman"/>
@@ -31,28 +102,59 @@
           <w:sz w:val="32"/>
           <w:szCs w:val="32"/>
         </w:rPr>
-        <w:t xml:space="preserve">AND ANDROID APP DEVELOPMENT STUDIO</w:t>
-      </w:r>
-    </w:p>
-    <w:p>
-      <w:pPr>
-        <w:spacing w:after="300" w:before="0"/>
-        <w:jc w:val="center"/>
+        <w:t xml:space="preserve">	310124104083</w:t>
+      </w:r>
+    </w:p>
+    <w:p>
+      <w:pPr>
+        <w:tabs>
+          <w:tab w:val="left" w:pos="6010"/>
+        </w:tabs>
+        <w:spacing w:after="1058" w:before="0" w:line="240"/>
+        <w:ind w:left="1370"/>
       </w:pPr>
       <w:r>
         <w:rPr>
           <w:rFonts w:ascii="Times New Roman" w:cs="Times New Roman" w:eastAsia="Times New Roman" w:hAnsi="Times New Roman"/>
           <w:b/>
           <w:bCs/>
-          <w:sz w:val="28"/>
-          <w:szCs w:val="28"/>
-        </w:rPr>
-        <w:t xml:space="preserve">A PROJECT REPORT</w:t>
-      </w:r>
-    </w:p>
-    <w:p>
-      <w:pPr>
-        <w:spacing w:after="300" w:before="0"/>
+          <w:sz w:val="32"/>
+          <w:szCs w:val="32"/>
+        </w:rPr>
+        <w:t xml:space="preserve">SHALOM ARPUTHA SINGH</w:t>
+      </w:r>
+      <w:r>
+        <w:rPr>
+          <w:rFonts w:ascii="Times New Roman" w:cs="Times New Roman" w:eastAsia="Times New Roman" w:hAnsi="Times New Roman"/>
+          <w:b/>
+          <w:bCs/>
+          <w:sz w:val="32"/>
+          <w:szCs w:val="32"/>
+        </w:rPr>
+        <w:t xml:space="preserve">	310124104089</w:t>
+      </w:r>
+    </w:p>
+    <w:p>
+      <w:pPr>
+        <w:spacing w:after="455" w:before="0" w:line="240"/>
+        <w:jc w:val="center"/>
+      </w:pPr>
+      <w:r>
+        <w:rPr>
+          <w:rFonts w:ascii="Times New Roman" w:cs="Times New Roman" w:eastAsia="Times New Roman" w:hAnsi="Times New Roman"/>
+          <w:b/>
+          <w:bCs/>
+          <w:i/>
+          <w:iCs/>
+          <w:sz w:val="30"/>
+          <w:szCs w:val="30"/>
+        </w:rPr>
+        <w:t xml:space="preserve">In Partial Fulfillment for The Award of The Degree</w:t>
+      </w:r>
+    </w:p>
+    <w:p>
+      <w:pPr>
+        <w:spacing w:after="484" w:before="0" w:line="240"/>
         <w:jc w:val="center"/>
       </w:pPr>
       <w:r>
@@ -65,70 +167,30 @@
           <w:sz w:val="28"/>
           <w:szCs w:val="28"/>
         </w:rPr>
-        <w:t xml:space="preserve">Submitted By</w:t>
-      </w:r>
-    </w:p>
-    <w:p>
-      <w:pPr>
-        <w:tabs>
-          <w:tab w:val="left" w:pos="5500"/>
-        </w:tabs>
-        <w:spacing w:after="100"/>
-        <w:ind w:left="1300"/>
+        <w:t xml:space="preserve">Of</w:t>
+      </w:r>
+    </w:p>
+    <w:p>
+      <w:pPr>
+        <w:spacing w:after="508" w:before="0" w:line="240"/>
+        <w:jc w:val="center"/>
       </w:pPr>
       <w:r>
         <w:rPr>
           <w:rFonts w:ascii="Times New Roman" w:cs="Times New Roman" w:eastAsia="Times New Roman" w:hAnsi="Times New Roman"/>
           <w:b/>
           <w:bCs/>
-          <w:sz w:val="28"/>
-          <w:szCs w:val="28"/>
-        </w:rPr>
-        <w:t xml:space="preserve">P. SANTHOSH</w:t>
-      </w:r>
-      <w:r>
-        <w:rPr>
-          <w:rFonts w:ascii="Times New Roman" w:cs="Times New Roman" w:eastAsia="Times New Roman" w:hAnsi="Times New Roman"/>
-          <w:b/>
-          <w:bCs/>
-          <w:sz w:val="28"/>
-          <w:szCs w:val="28"/>
-        </w:rPr>
-        <w:t xml:space="preserve">	310124104083</w:t>
-      </w:r>
-    </w:p>
-    <w:p>
-      <w:pPr>
-        <w:tabs>
-          <w:tab w:val="left" w:pos="5500"/>
-        </w:tabs>
-        <w:spacing w:after="100"/>
-        <w:ind w:left="1300"/>
-      </w:pPr>
-      <w:r>
-        <w:rPr>
-          <w:rFonts w:ascii="Times New Roman" w:cs="Times New Roman" w:eastAsia="Times New Roman" w:hAnsi="Times New Roman"/>
-          <w:b/>
-          <w:bCs/>
-          <w:sz w:val="28"/>
-          <w:szCs w:val="28"/>
-        </w:rPr>
-        <w:t xml:space="preserve">SHALOM ARPUTHA SINGH</w:t>
-      </w:r>
-      <w:r>
-        <w:rPr>
-          <w:rFonts w:ascii="Times New Roman" w:cs="Times New Roman" w:eastAsia="Times New Roman" w:hAnsi="Times New Roman"/>
-          <w:b/>
-          <w:bCs/>
-          <w:sz w:val="28"/>
-          <w:szCs w:val="28"/>
-        </w:rPr>
-        <w:t xml:space="preserve">	310124104089</w:t>
-      </w:r>
-    </w:p>
-    <w:p>
-      <w:pPr>
-        <w:spacing w:after="160" w:before="420"/>
+          <w:i w:val="false"/>
+          <w:iCs w:val="false"/>
+          <w:sz w:val="32"/>
+          <w:szCs w:val="32"/>
+        </w:rPr>
+        <w:t xml:space="preserve">BACHELOR OF ENGINEERING</w:t>
+      </w:r>
+    </w:p>
+    <w:p>
+      <w:pPr>
+        <w:spacing w:after="482" w:before="0" w:line="240"/>
         <w:jc w:val="center"/>
       </w:pPr>
       <w:r>
@@ -138,15 +200,15 @@
           <w:bCs/>
           <w:i/>
           <w:iCs/>
-          <w:sz w:val="26"/>
-          <w:szCs w:val="26"/>
-        </w:rPr>
-        <w:t xml:space="preserve">In Partial Fulfillment for The Award of The Degree</w:t>
-      </w:r>
-    </w:p>
-    <w:p>
-      <w:pPr>
-        <w:spacing w:after="160" w:before="0"/>
+          <w:sz w:val="28"/>
+          <w:szCs w:val="28"/>
+        </w:rPr>
+        <w:t xml:space="preserve">in</w:t>
+      </w:r>
+    </w:p>
+    <w:p>
+      <w:pPr>
+        <w:spacing w:after="504" w:before="0" w:line="240"/>
         <w:jc w:val="center"/>
       </w:pPr>
       <w:r>
@@ -154,17 +216,17 @@
           <w:rFonts w:ascii="Times New Roman" w:cs="Times New Roman" w:eastAsia="Times New Roman" w:hAnsi="Times New Roman"/>
           <w:b/>
           <w:bCs/>
-          <w:i/>
-          <w:iCs/>
-          <w:sz w:val="26"/>
-          <w:szCs w:val="26"/>
-        </w:rPr>
-        <w:t xml:space="preserve">Of</w:t>
-      </w:r>
-    </w:p>
-    <w:p>
-      <w:pPr>
-        <w:spacing w:after="160" w:before="0"/>
+          <w:i w:val="false"/>
+          <w:iCs w:val="false"/>
+          <w:sz w:val="32"/>
+          <w:szCs w:val="32"/>
+        </w:rPr>
+        <w:t xml:space="preserve">COMPUTER SCIENCE AND ENGINEERING</w:t>
+      </w:r>
+    </w:p>
+    <w:p>
+      <w:pPr>
+        <w:spacing w:after="319" w:before="0" w:line="240"/>
         <w:jc w:val="center"/>
       </w:pPr>
       <w:r>
@@ -172,15 +234,17 @@
           <w:rFonts w:ascii="Times New Roman" w:cs="Times New Roman" w:eastAsia="Times New Roman" w:hAnsi="Times New Roman"/>
           <w:b/>
           <w:bCs/>
-          <w:sz w:val="28"/>
-          <w:szCs w:val="28"/>
-        </w:rPr>
-        <w:t xml:space="preserve">BACHELOR OF ENGINEERING</w:t>
-      </w:r>
-    </w:p>
-    <w:p>
-      <w:pPr>
-        <w:spacing w:after="160" w:before="0"/>
+          <w:i w:val="false"/>
+          <w:iCs w:val="false"/>
+          <w:sz w:val="34"/>
+          <w:szCs w:val="34"/>
+        </w:rPr>
+        <w:t xml:space="preserve">ANAND INSTITUTE OF HIGHER TECHNOLOGY</w:t>
+      </w:r>
+    </w:p>
+    <w:p>
+      <w:pPr>
+        <w:spacing w:after="460" w:before="0" w:line="240"/>
         <w:jc w:val="center"/>
       </w:pPr>
       <w:r>
@@ -188,73 +252,25 @@
           <w:rFonts w:ascii="Times New Roman" w:cs="Times New Roman" w:eastAsia="Times New Roman" w:hAnsi="Times New Roman"/>
           <w:b/>
           <w:bCs/>
-          <w:i/>
-          <w:iCs/>
-          <w:sz w:val="26"/>
-          <w:szCs w:val="26"/>
-        </w:rPr>
-        <w:t xml:space="preserve">in</w:t>
-      </w:r>
-    </w:p>
-    <w:p>
-      <w:pPr>
-        <w:spacing w:after="160" w:before="0"/>
-        <w:jc w:val="center"/>
-      </w:pPr>
-      <w:r>
-        <w:rPr>
-          <w:rFonts w:ascii="Times New Roman" w:cs="Times New Roman" w:eastAsia="Times New Roman" w:hAnsi="Times New Roman"/>
-          <w:b/>
-          <w:bCs/>
+          <w:i w:val="false"/>
+          <w:iCs w:val="false"/>
           <w:sz w:val="28"/>
           <w:szCs w:val="28"/>
         </w:rPr>
-        <w:t xml:space="preserve">COMPUTER SCIENCE AND ENGINEERING</w:t>
-      </w:r>
-    </w:p>
-    <w:p>
-      <w:pPr>
-        <w:spacing w:after="20" w:before="0"/>
-        <w:jc w:val="center"/>
-      </w:pPr>
-      <w:r>
-        <w:rPr>
-          <w:rFonts w:ascii="Times New Roman" w:cs="Times New Roman" w:eastAsia="Times New Roman" w:hAnsi="Times New Roman"/>
-          <w:b/>
-          <w:bCs/>
-          <w:sz w:val="32"/>
-          <w:szCs w:val="32"/>
-        </w:rPr>
-        <w:t xml:space="preserve">ANAND INSTITUTE OF HIGHER TECHNOLOGY</w:t>
-      </w:r>
-    </w:p>
-    <w:p>
-      <w:pPr>
-        <w:spacing w:after="160" w:before="0"/>
-        <w:jc w:val="center"/>
-      </w:pPr>
-      <w:r>
-        <w:rPr>
-          <w:rFonts w:ascii="Times New Roman" w:cs="Times New Roman" w:eastAsia="Times New Roman" w:hAnsi="Times New Roman"/>
-          <w:b/>
-          <w:bCs/>
-          <w:sz w:val="22"/>
-          <w:szCs w:val="22"/>
-        </w:rPr>
         <w:t xml:space="preserve">(AN AUTONOMOUS INSTITUTION)</w:t>
       </w:r>
     </w:p>
     <w:p>
       <w:pPr>
-        <w:spacing w:after="60" w:before="60"/>
+        <w:spacing w:after="0" w:before="0"/>
         <w:jc w:val="center"/>
       </w:pPr>
       <w:r>
         <w:drawing>
           <wp:inline distT="0" distB="0" distL="0" distR="0">
-            <wp:extent cx="1428750" cy="1457325"/>
+            <wp:extent cx="1781175" cy="1809750"/>
             <wp:effectExtent t="0" r="0" b="0" l="0"/>
-            <wp:docPr id="1" name="Anand Institute of Higher Technology logo" descr="Anand Institute of Higher Technology logo" title="Anand Institute of Higher Technology logo"/>
+            <wp:docPr id="1" name="logo" descr="logo" title="Anand Institute of Higher Technology logo"/>
             <wp:cNvGraphicFramePr>
               <a:graphicFrameLocks xmlns:a="http://schemas.openxmlformats.org/drawingml/2006/main" noChangeAspect="1"/>
             </wp:cNvGraphicFramePr>
@@ -277,7 +293,7 @@
                   <pic:spPr bwMode="auto">
                     <a:xfrm>
                       <a:off x="0" y="0"/>
-                      <a:ext cx="1428750" cy="1457325"/>
+                      <a:ext cx="1781175" cy="1809750"/>
                     </a:xfrm>
                     <a:prstGeom prst="rect">
                       <a:avLst/>
@@ -292,7 +308,7 @@
     </w:p>
     <w:p>
       <w:pPr>
-        <w:spacing w:after="100" w:before="160"/>
+        <w:spacing w:after="310" w:before="0" w:line="240"/>
         <w:jc w:val="center"/>
       </w:pPr>
       <w:r>
@@ -300,15 +316,17 @@
           <w:rFonts w:ascii="Times New Roman" w:cs="Times New Roman" w:eastAsia="Times New Roman" w:hAnsi="Times New Roman"/>
           <w:b/>
           <w:bCs/>
-          <w:sz w:val="28"/>
-          <w:szCs w:val="28"/>
+          <w:i w:val="false"/>
+          <w:iCs w:val="false"/>
+          <w:sz w:val="32"/>
+          <w:szCs w:val="32"/>
         </w:rPr>
         <w:t xml:space="preserve">ANNA UNIVERSITY: CHENNAI 600025</w:t>
       </w:r>
     </w:p>
     <w:p>
       <w:pPr>
-        <w:spacing w:after="160" w:before="0"/>
+        <w:spacing w:after="310" w:before="0" w:line="240"/>
         <w:jc w:val="center"/>
       </w:pPr>
       <w:r>
@@ -316,16 +334,29 @@
           <w:rFonts w:ascii="Times New Roman" w:cs="Times New Roman" w:eastAsia="Times New Roman" w:hAnsi="Times New Roman"/>
           <w:b/>
           <w:bCs/>
-          <w:sz w:val="28"/>
-          <w:szCs w:val="28"/>
+          <w:i w:val="false"/>
+          <w:iCs w:val="false"/>
+          <w:sz w:val="32"/>
+          <w:szCs w:val="32"/>
         </w:rPr>
         <w:t xml:space="preserve">NOVEMBER 2026</w:t>
       </w:r>
     </w:p>
     <w:p>
-      <w:r>
-        <w:br w:type="page"/>
-      </w:r>
+      <w:pPr>
+        <w:sectPr>
+          <w:pgSz w:w="11906" w:h="16838" w:orient="portrait"/>
+          <w:pgMar w:top="1128" w:right="1250" w:bottom="1200" w:left="1250" w:header="708" w:footer="708" w:gutter="0"/>
+          <w:pgBorders w:display="allPages" w:offsetFrom="page" w:zOrder="front">
+            <w:top w:val="single" w:color="000000" w:sz="24" w:space="24"/>
+            <w:left w:val="single" w:color="000000" w:sz="24" w:space="24"/>
+            <w:bottom w:val="single" w:color="000000" w:sz="24" w:space="24"/>
+            <w:right w:val="single" w:color="000000" w:sz="24" w:space="24"/>
+          </w:pgBorders>
+          <w:pgNumType/>
+          <w:docGrid w:linePitch="360"/>
+        </w:sectPr>
+      </w:pPr>
     </w:p>
     <w:p>
       <w:pPr>
@@ -9139,13 +9170,14 @@
       </w:r>
     </w:p>
     <w:sectPr>
+      <w:type w:val="nextPage"/>
       <w:pgSz w:w="11906" w:h="16838" w:orient="portrait"/>
       <w:pgMar w:top="1300" w:right="1200" w:bottom="1200" w:left="1300" w:header="708" w:footer="708" w:gutter="0"/>
       <w:pgBorders w:display="allPages" w:offsetFrom="page" w:zOrder="front">
-        <w:top w:val="single" w:color="000000" w:sz="12" w:space="24"/>
-        <w:left w:val="single" w:color="000000" w:sz="12" w:space="24"/>
-        <w:bottom w:val="single" w:color="000000" w:sz="12" w:space="24"/>
-        <w:right w:val="single" w:color="000000" w:sz="12" w:space="24"/>
+        <w:top w:val="single" w:color="000000" w:sz="24" w:space="24"/>
+        <w:left w:val="single" w:color="000000" w:sz="24" w:space="24"/>
+        <w:bottom w:val="single" w:color="000000" w:sz="24" w:space="24"/>
+        <w:right w:val="single" w:color="000000" w:sz="24" w:space="24"/>
       </w:pgBorders>
       <w:pgNumType/>
       <w:docGrid w:linePitch="360"/>

</xml_diff>

<commit_message>
Report: conclusion at bottom of last page, 3+2 figure layout like the reference
Co-Authored-By: Claude Sonnet 5.5 <noreply@anthropic.com>
Claude-Session: https://claude.ai/code/session_01Rfq5Dt6BZhovMc3QG1hQug
</commit_message>
<xml_diff>
--- a/docs/report/AppPanrom_Project_Report.docx
+++ b/docs/report/AppPanrom_Project_Report.docx
@@ -8072,7 +8072,7 @@
           <wp:inline distT="0" distB="0" distL="0" distR="0">
             <wp:extent cx="4314825" cy="2695575"/>
             <wp:effectExtent t="0" r="0" b="0" l="0"/>
-            <wp:docPr id="1" name="Fig. 2: A mistake in the code: error state and console message" descr="Fig. 2: A mistake in the code: error state and console message" title="Fig. 2: A mistake in the code: error state and console message"/>
+            <wp:docPr id="1" name="Fig. 2: Visual designer: palette, code and phone canvas" descr="Fig. 2: Visual designer: palette, code and phone canvas" title="Fig. 2: Visual designer: palette, code and phone canvas"/>
             <wp:cNvGraphicFramePr>
               <a:graphicFrameLocks xmlns:a="http://schemas.openxmlformats.org/drawingml/2006/main" noChangeAspect="1"/>
             </wp:cNvGraphicFramePr>
@@ -8121,7 +8121,7 @@
           <w:sz w:val="28"/>
           <w:szCs w:val="28"/>
         </w:rPr>
-        <w:t xml:space="preserve">Fig. 2: A mistake in the code: error state and console message</w:t>
+        <w:t xml:space="preserve">Fig. 2: Visual designer: palette, code and phone canvas</w:t>
       </w:r>
     </w:p>
     <w:p>
@@ -8135,7 +8135,7 @@
           <wp:inline distT="0" distB="0" distL="0" distR="0">
             <wp:extent cx="4314825" cy="2695575"/>
             <wp:effectExtent t="0" r="0" b="0" l="0"/>
-            <wp:docPr id="1" name="Fig. 3: A styled two-screen app with navigation and storage" descr="Fig. 3: A styled two-screen app with navigation and storage" title="Fig. 3: A styled two-screen app with navigation and storage"/>
+            <wp:docPr id="1" name="Fig. 3: Code updated live after dragging and editing components" descr="Fig. 3: Code updated live after dragging and editing components" title="Fig. 3: Code updated live after dragging and editing components"/>
             <wp:cNvGraphicFramePr>
               <a:graphicFrameLocks xmlns:a="http://schemas.openxmlformats.org/drawingml/2006/main" noChangeAspect="1"/>
             </wp:cNvGraphicFramePr>
@@ -8184,7 +8184,7 @@
           <w:sz w:val="28"/>
           <w:szCs w:val="28"/>
         </w:rPr>
-        <w:t xml:space="preserve">Fig. 3: A styled two-screen app with navigation and storage</w:t>
+        <w:t xml:space="preserve">Fig. 3: Code updated live after dragging and editing components</w:t>
       </w:r>
     </w:p>
     <w:p>
@@ -8201,9 +8201,9 @@
       <w:r>
         <w:drawing>
           <wp:inline distT="0" distB="0" distL="0" distR="0">
-            <wp:extent cx="4314825" cy="2695575"/>
+            <wp:extent cx="5591175" cy="3495675"/>
             <wp:effectExtent t="0" r="0" b="0" l="0"/>
-            <wp:docPr id="1" name="Fig. 4: Visual designer: palette, code and phone canvas" descr="Fig. 4: Visual designer: palette, code and phone canvas" title="Fig. 4: Visual designer: palette, code and phone canvas"/>
+            <wp:docPr id="1" name="Fig. 4: A styled two-screen app with navigation and storage" descr="Fig. 4: A styled two-screen app with navigation and storage" title="Fig. 4: A styled two-screen app with navigation and storage"/>
             <wp:cNvGraphicFramePr>
               <a:graphicFrameLocks xmlns:a="http://schemas.openxmlformats.org/drawingml/2006/main" noChangeAspect="1"/>
             </wp:cNvGraphicFramePr>
@@ -8226,7 +8226,7 @@
                   <pic:spPr bwMode="auto">
                     <a:xfrm>
                       <a:off x="0" y="0"/>
-                      <a:ext cx="4314825" cy="2695575"/>
+                      <a:ext cx="5591175" cy="3495675"/>
                     </a:xfrm>
                     <a:prstGeom prst="rect">
                       <a:avLst/>
@@ -8241,7 +8241,7 @@
     </w:p>
     <w:p>
       <w:pPr>
-        <w:spacing w:after="120" w:before="0" w:line="276" w:lineRule="auto"/>
+        <w:spacing w:after="200" w:before="0" w:line="276" w:lineRule="auto"/>
         <w:jc w:val="center"/>
       </w:pPr>
       <w:r>
@@ -8252,7 +8252,7 @@
           <w:sz w:val="28"/>
           <w:szCs w:val="28"/>
         </w:rPr>
-        <w:t xml:space="preserve">Fig. 4: Visual designer: palette, code and phone canvas</w:t>
+        <w:t xml:space="preserve">Fig. 4: A styled two-screen app with navigation and storage</w:t>
       </w:r>
     </w:p>
     <w:p>
@@ -8264,9 +8264,9 @@
       <w:r>
         <w:drawing>
           <wp:inline distT="0" distB="0" distL="0" distR="0">
-            <wp:extent cx="4314825" cy="2695575"/>
+            <wp:extent cx="5591175" cy="3495675"/>
             <wp:effectExtent t="0" r="0" b="0" l="0"/>
-            <wp:docPr id="1" name="Fig. 5: Code updated live after dragging and editing components" descr="Fig. 5: Code updated live after dragging and editing components" title="Fig. 5: Code updated live after dragging and editing components"/>
+            <wp:docPr id="1" name="Fig. 5: Build panel with an honest failure when the SDK is missing" descr="Fig. 5: Build panel with an honest failure when the SDK is missing" title="Fig. 5: Build panel with an honest failure when the SDK is missing"/>
             <wp:cNvGraphicFramePr>
               <a:graphicFrameLocks xmlns:a="http://schemas.openxmlformats.org/drawingml/2006/main" noChangeAspect="1"/>
             </wp:cNvGraphicFramePr>
@@ -8289,7 +8289,7 @@
                   <pic:spPr bwMode="auto">
                     <a:xfrm>
                       <a:off x="0" y="0"/>
-                      <a:ext cx="4314825" cy="2695575"/>
+                      <a:ext cx="5591175" cy="3495675"/>
                     </a:xfrm>
                     <a:prstGeom prst="rect">
                       <a:avLst/>
@@ -8304,7 +8304,7 @@
     </w:p>
     <w:p>
       <w:pPr>
-        <w:spacing w:after="120" w:before="0" w:line="276" w:lineRule="auto"/>
+        <w:spacing w:after="200" w:before="0" w:line="276" w:lineRule="auto"/>
         <w:jc w:val="center"/>
       </w:pPr>
       <w:r>
@@ -8315,81 +8315,30 @@
           <w:sz w:val="28"/>
           <w:szCs w:val="28"/>
         </w:rPr>
-        <w:t xml:space="preserve">Fig. 5: Code updated live after dragging and editing components</w:t>
+        <w:t xml:space="preserve">Fig. 5: Build panel with an honest failure when the SDK is missing</w:t>
+      </w:r>
+    </w:p>
+    <w:p>
+      <w:r>
+        <w:br w:type="page"/>
+      </w:r>
+    </w:p>
+    <w:p>
+      <w:pPr>
+        <w:spacing w:after="0" w:before="0" w:line="10000" w:lineRule="exact"/>
+      </w:pPr>
+      <w:r>
+        <w:rPr>
+          <w:sz w:val="4"/>
+          <w:szCs w:val="4"/>
+        </w:rPr>
+        <w:t xml:space="preserve"> </w:t>
       </w:r>
     </w:p>
     <w:p>
       <w:pPr>
         <w:keepNext/>
-        <w:spacing w:after="40" w:before="0" w:line="240" w:lineRule="auto"/>
-        <w:jc w:val="center"/>
-      </w:pPr>
-      <w:r>
-        <w:drawing>
-          <wp:inline distT="0" distB="0" distL="0" distR="0">
-            <wp:extent cx="4314825" cy="2695575"/>
-            <wp:effectExtent t="0" r="0" b="0" l="0"/>
-            <wp:docPr id="1" name="Fig. 6: Build panel with an honest failure when the SDK is missing" descr="Fig. 6: Build panel with an honest failure when the SDK is missing" title="Fig. 6: Build panel with an honest failure when the SDK is missing"/>
-            <wp:cNvGraphicFramePr>
-              <a:graphicFrameLocks xmlns:a="http://schemas.openxmlformats.org/drawingml/2006/main" noChangeAspect="1"/>
-            </wp:cNvGraphicFramePr>
-            <a:graphic xmlns:a="http://schemas.openxmlformats.org/drawingml/2006/main">
-              <a:graphicData uri="http://schemas.openxmlformats.org/drawingml/2006/picture">
-                <pic:pic xmlns:pic="http://schemas.openxmlformats.org/drawingml/2006/picture">
-                  <pic:nvPicPr>
-                    <pic:cNvPr id="0" name="" descr=""/>
-                    <pic:cNvPicPr>
-                      <a:picLocks noChangeAspect="1" noChangeArrowheads="1"/>
-                    </pic:cNvPicPr>
-                  </pic:nvPicPr>
-                  <pic:blipFill>
-                    <a:blip r:embed="rId15" cstate="none"/>
-                    <a:srcRect/>
-                    <a:stretch>
-                      <a:fillRect/>
-                    </a:stretch>
-                  </pic:blipFill>
-                  <pic:spPr bwMode="auto">
-                    <a:xfrm>
-                      <a:off x="0" y="0"/>
-                      <a:ext cx="4314825" cy="2695575"/>
-                    </a:xfrm>
-                    <a:prstGeom prst="rect">
-                      <a:avLst/>
-                    </a:prstGeom>
-                  </pic:spPr>
-                </pic:pic>
-              </a:graphicData>
-            </a:graphic>
-          </wp:inline>
-        </w:drawing>
-      </w:r>
-    </w:p>
-    <w:p>
-      <w:pPr>
-        <w:spacing w:after="120" w:before="0" w:line="276" w:lineRule="auto"/>
-        <w:jc w:val="center"/>
-      </w:pPr>
-      <w:r>
-        <w:rPr>
-          <w:rFonts w:ascii="Bodoni MT" w:cs="Bodoni MT" w:eastAsia="Bodoni MT" w:hAnsi="Bodoni MT"/>
-          <w:i/>
-          <w:iCs/>
-          <w:sz w:val="28"/>
-          <w:szCs w:val="28"/>
-        </w:rPr>
-        <w:t xml:space="preserve">Fig. 6: Build panel with an honest failure when the SDK is missing</w:t>
-      </w:r>
-    </w:p>
-    <w:p>
-      <w:r>
-        <w:br w:type="page"/>
-      </w:r>
-    </w:p>
-    <w:p>
-      <w:pPr>
-        <w:keepNext/>
-        <w:spacing w:after="200"/>
+        <w:spacing w:after="200" w:line="240" w:lineRule="auto"/>
       </w:pPr>
       <w:r>
         <w:rPr>
@@ -8424,7 +8373,7 @@
           <w:sz w:val="30"/>
           <w:szCs w:val="30"/>
         </w:rPr>
-        <w:t xml:space="preserve">AppPanrom brings a Tanglish programming language, a visual designer and an Android build pipeline together in one studio. Source code passes through lexical, syntax and semantic analysis into a validated intermediate representation that one shared runtime renders identically in the live preview and in the Android app. The drag-and-drop designer and the code editor change the same text, so they update each other live. Errors are reported with line numbers, resource limits protect against unsafe programs, and a build is reported as successful only when a verified artifact exists.</w:t>
+        <w:t xml:space="preserve">AppPanrom brings a Tanglish language, a visual designer and an Android build pipeline together in one studio. Source code passes through lexical, syntax and semantic analysis into one validated intermediate representation that a shared runtime renders identically in the preview and in the Android app. The designer and the code editor change the same text, so they update each other live, and a build is reported successful only when a verified artifact exists.</w:t>
       </w:r>
     </w:p>
     <w:p>
@@ -8438,7 +8387,7 @@
           <w:sz w:val="30"/>
           <w:szCs w:val="30"/>
         </w:rPr>
-        <w:t xml:space="preserve">Status: the language, runtime, Studio, designer, backend, icon, permission and signing logic are implemented and tested (114 backend tests, 30 runtime tests, 15 browser scenarios). The Android build was exercised with a Gradle test double plus real keytool and jarsigner; a full Gradle build with the Android SDK and an install on a device could not be done because the SDK download host was unreachable, and is the first item for future work, together with network access through a safe proxy and camera and location features.</w:t>
+        <w:t xml:space="preserve">A full Gradle build with the Android SDK and an install on a device could not be done in the development environment, and is the first item for future work, along with network access and camera and location features.</w:t>
       </w:r>
     </w:p>
     <w:sectPr>

</xml_diff>

<commit_message>
Report: conclusion at the top of the last page
Co-Authored-By: Claude Sonnet 5.5 <noreply@anthropic.com>
Claude-Session: https://claude.ai/code/session_01Rfq5Dt6BZhovMc3QG1hQug
</commit_message>
<xml_diff>
--- a/docs/report/AppPanrom_Project_Report.docx
+++ b/docs/report/AppPanrom_Project_Report.docx
@@ -8321,18 +8321,6 @@
     <w:p>
       <w:r>
         <w:br w:type="page"/>
-      </w:r>
-    </w:p>
-    <w:p>
-      <w:pPr>
-        <w:spacing w:after="0" w:before="0" w:line="10000" w:lineRule="exact"/>
-      </w:pPr>
-      <w:r>
-        <w:rPr>
-          <w:sz w:val="4"/>
-          <w:szCs w:val="4"/>
-        </w:rPr>
-        <w:t xml:space="preserve"> </w:t>
       </w:r>
     </w:p>
     <w:p>

</xml_diff>

<commit_message>
Report: author name M. SHALOM ARPUTHA SINGH on cover
Co-Authored-By: Claude Sonnet 5.5 <noreply@anthropic.com>
Claude-Session: https://claude.ai/code/session_01Rfq5Dt6BZhovMc3QG1hQug
</commit_message>
<xml_diff>
--- a/docs/report/AppPanrom_Project_Report.docx
+++ b/docs/report/AppPanrom_Project_Report.docx
@@ -79,7 +79,7 @@
     <w:p>
       <w:pPr>
         <w:tabs>
-          <w:tab w:val="left" w:pos="6010"/>
+          <w:tab w:val="left" w:pos="6490"/>
         </w:tabs>
         <w:spacing w:after="182" w:before="0" w:line="240" w:lineRule="auto"/>
         <w:ind w:left="1370"/>
@@ -108,7 +108,7 @@
     <w:p>
       <w:pPr>
         <w:tabs>
-          <w:tab w:val="left" w:pos="6010"/>
+          <w:tab w:val="left" w:pos="6490"/>
         </w:tabs>
         <w:spacing w:after="930" w:before="0" w:line="240" w:lineRule="auto"/>
         <w:ind w:left="1370"/>
@@ -121,7 +121,7 @@
           <w:sz w:val="32"/>
           <w:szCs w:val="32"/>
         </w:rPr>
-        <w:t xml:space="preserve">SHALOM ARPUTHA SINGH</w:t>
+        <w:t xml:space="preserve">M. SHALOM ARPUTHA SINGH</w:t>
       </w:r>
       <w:r>
         <w:rPr>

</xml_diff>